<commit_message>
docs(dma, uart, i2c): list the libraries each upstream ip needs
Audit against upstream: apb_i2c, apb_uart and idma under vendor/ are
byte-identical to their pinned commits. What the specifications missed are
the libraries: apb_uart needs obi, apb, the common_cells deprecated shims
and tech_cells_generic (tc_sync); iDMA needs common_cells cc_stream_* modules
and apb typedef.svh. apb_uart linted clean with Verilator 5 against the
common_cells commit design/bus vendors (one latch warning, recorded as a
waiver). DMA MAS V3.1. The I2C licence is the OpenCores notice, not SHL.
</commit_message>
<xml_diff>
--- a/doc/specs/docx/QNSC_DMA_MAS.docx
+++ b/doc/specs/docx/QNSC_DMA_MAS.docx
@@ -15,7 +15,7 @@
         <w:pStyle w:val="Subtitle"/>
       </w:pPr>
       <w:r>
-        <w:t xml:space="preserve">MICRO-ARCHITECTURE SPECIFICATION – V3.0</w:t>
+        <w:t xml:space="preserve">MICRO-ARCHITECTURE SPECIFICATION – V3.1</w:t>
       </w:r>
     </w:p>
     <w:p>
@@ -460,6 +460,101 @@
           </w:p>
         </w:tc>
       </w:tr>
+      <w:tr>
+        <w:tc>
+          <w:tcPr/>
+          <w:p>
+            <w:pPr>
+              <w:pStyle w:val="Compact"/>
+              <w:jc w:val="left"/>
+            </w:pPr>
+            <w:r>
+              <w:t xml:space="preserve">V3.1</w:t>
+            </w:r>
+          </w:p>
+        </w:tc>
+        <w:tc>
+          <w:tcPr/>
+          <w:p>
+            <w:pPr>
+              <w:pStyle w:val="Compact"/>
+              <w:jc w:val="left"/>
+            </w:pPr>
+            <w:r>
+              <w:t xml:space="preserve">2026-09-28</w:t>
+            </w:r>
+          </w:p>
+        </w:tc>
+        <w:tc>
+          <w:tcPr/>
+          <w:p>
+            <w:pPr>
+              <w:pStyle w:val="Compact"/>
+              <w:jc w:val="left"/>
+            </w:pPr>
+            <w:r>
+              <w:t xml:space="preserve">Nghia VT (lead)</w:t>
+            </w:r>
+          </w:p>
+        </w:tc>
+        <w:tc>
+          <w:tcPr/>
+          <w:p>
+            <w:pPr>
+              <w:pStyle w:val="Compact"/>
+              <w:jc w:val="left"/>
+            </w:pPr>
+            <w:r>
+              <w:t xml:space="preserve">–</w:t>
+            </w:r>
+          </w:p>
+        </w:tc>
+        <w:tc>
+          <w:tcPr/>
+          <w:p>
+            <w:pPr>
+              <w:pStyle w:val="Compact"/>
+              <w:jc w:val="left"/>
+            </w:pPr>
+            <w:r>
+              <w:t xml:space="preserve">Section 4: the libraries iDMA needs (</w:t>
+            </w:r>
+            <w:r>
+              <w:rPr>
+                <w:rStyle w:val="VerbatimChar"/>
+              </w:rPr>
+              <w:t xml:space="preserve">common_cells</w:t>
+            </w:r>
+            <w:r>
+              <w:t xml:space="preserve">,</w:t>
+            </w:r>
+            <w:r>
+              <w:t xml:space="preserve"> </w:t>
+            </w:r>
+            <w:r>
+              <w:rPr>
+                <w:rStyle w:val="VerbatimChar"/>
+              </w:rPr>
+              <w:t xml:space="preserve">axi</w:t>
+            </w:r>
+            <w:r>
+              <w:t xml:space="preserve">,</w:t>
+            </w:r>
+            <w:r>
+              <w:t xml:space="preserve"> </w:t>
+            </w:r>
+            <w:r>
+              <w:rPr>
+                <w:rStyle w:val="VerbatimChar"/>
+              </w:rPr>
+              <w:t xml:space="preserve">apb</w:t>
+            </w:r>
+            <w:r>
+              <w:t xml:space="preserve">)</w:t>
+            </w:r>
+          </w:p>
+        </w:tc>
+      </w:tr>
     </w:tbl>
     <w:bookmarkEnd w:id="26"/>
     <w:bookmarkStart w:id="27" w:name="overview"/>
@@ -1593,6 +1688,294 @@
           </w:p>
         </w:tc>
       </w:tr>
+      <w:tr>
+        <w:tc>
+          <w:tcPr/>
+          <w:p>
+            <w:pPr>
+              <w:pStyle w:val="Compact"/>
+              <w:jc w:val="left"/>
+            </w:pPr>
+            <w:r>
+              <w:rPr>
+                <w:rStyle w:val="VerbatimChar"/>
+              </w:rPr>
+              <w:t xml:space="preserve">pulp-platform/common_cells</w:t>
+            </w:r>
+          </w:p>
+        </w:tc>
+        <w:tc>
+          <w:tcPr/>
+          <w:p>
+            <w:pPr>
+              <w:pStyle w:val="Compact"/>
+              <w:jc w:val="left"/>
+            </w:pPr>
+            <w:r>
+              <w:rPr>
+                <w:rStyle w:val="VerbatimChar"/>
+              </w:rPr>
+              <w:t xml:space="preserve">cc_stream_fifo_optimal_wrap</w:t>
+            </w:r>
+            <w:r>
+              <w:t xml:space="preserve">,</w:t>
+            </w:r>
+            <w:r>
+              <w:t xml:space="preserve"> </w:t>
+            </w:r>
+            <w:r>
+              <w:rPr>
+                <w:rStyle w:val="VerbatimChar"/>
+              </w:rPr>
+              <w:t xml:space="preserve">cc_passthrough_stream_fifo</w:t>
+            </w:r>
+            <w:r>
+              <w:t xml:space="preserve">,</w:t>
+            </w:r>
+            <w:r>
+              <w:t xml:space="preserve"> </w:t>
+            </w:r>
+            <w:r>
+              <w:rPr>
+                <w:rStyle w:val="VerbatimChar"/>
+              </w:rPr>
+              <w:t xml:space="preserve">cc_fall_through_register</w:t>
+            </w:r>
+            <w:r>
+              <w:t xml:space="preserve">,</w:t>
+            </w:r>
+            <w:r>
+              <w:t xml:space="preserve"> </w:t>
+            </w:r>
+            <w:r>
+              <w:rPr>
+                <w:rStyle w:val="VerbatimChar"/>
+              </w:rPr>
+              <w:t xml:space="preserve">cc_stream_fork</w:t>
+            </w:r>
+            <w:r>
+              <w:t xml:space="preserve">,</w:t>
+            </w:r>
+            <w:r>
+              <w:t xml:space="preserve"> </w:t>
+            </w:r>
+            <w:r>
+              <w:rPr>
+                <w:rStyle w:val="VerbatimChar"/>
+              </w:rPr>
+              <w:t xml:space="preserve">cc_stream_join</w:t>
+            </w:r>
+            <w:r>
+              <w:t xml:space="preserve">,</w:t>
+            </w:r>
+            <w:r>
+              <w:t xml:space="preserve"> </w:t>
+            </w:r>
+            <w:r>
+              <w:rPr>
+                <w:rStyle w:val="VerbatimChar"/>
+              </w:rPr>
+              <w:t xml:space="preserve">cc_popcount</w:t>
+            </w:r>
+            <w:r>
+              <w:t xml:space="preserve">,</w:t>
+            </w:r>
+            <w:r>
+              <w:t xml:space="preserve"> </w:t>
+            </w:r>
+            <w:r>
+              <w:rPr>
+                <w:rStyle w:val="VerbatimChar"/>
+              </w:rPr>
+              <w:t xml:space="preserve">cc_rr_arb_tree</w:t>
+            </w:r>
+            <w:r>
+              <w:t xml:space="preserve">;</w:t>
+            </w:r>
+            <w:r>
+              <w:t xml:space="preserve"> </w:t>
+            </w:r>
+            <w:r>
+              <w:rPr>
+                <w:rStyle w:val="VerbatimChar"/>
+              </w:rPr>
+              <w:t xml:space="preserve">registers.svh</w:t>
+            </w:r>
+          </w:p>
+        </w:tc>
+        <w:tc>
+          <w:tcPr/>
+          <w:p>
+            <w:pPr>
+              <w:pStyle w:val="Compact"/>
+              <w:jc w:val="left"/>
+            </w:pPr>
+            <w:r>
+              <w:rPr>
+                <w:rStyle w:val="VerbatimChar"/>
+              </w:rPr>
+              <w:t xml:space="preserve">db427693</w:t>
+            </w:r>
+            <w:r>
+              <w:t xml:space="preserve"> </w:t>
+            </w:r>
+            <w:r>
+              <w:t xml:space="preserve">(v2.0.0-beta.3+3), the copy</w:t>
+            </w:r>
+            <w:r>
+              <w:t xml:space="preserve"> </w:t>
+            </w:r>
+            <w:r>
+              <w:rPr>
+                <w:rStyle w:val="VerbatimChar"/>
+              </w:rPr>
+              <w:t xml:space="preserve">design/bus</w:t>
+            </w:r>
+            <w:r>
+              <w:t xml:space="preserve"> </w:t>
+            </w:r>
+            <w:r>
+              <w:t xml:space="preserve">uses; iDMA asks for 2.0.0-beta.3</w:t>
+            </w:r>
+          </w:p>
+        </w:tc>
+        <w:tc>
+          <w:tcPr/>
+          <w:p>
+            <w:pPr>
+              <w:pStyle w:val="Compact"/>
+              <w:jc w:val="left"/>
+            </w:pPr>
+            <w:r>
+              <w:t xml:space="preserve">SHL-0.51</w:t>
+            </w:r>
+          </w:p>
+        </w:tc>
+      </w:tr>
+      <w:tr>
+        <w:tc>
+          <w:tcPr/>
+          <w:p>
+            <w:pPr>
+              <w:pStyle w:val="Compact"/>
+              <w:jc w:val="left"/>
+            </w:pPr>
+            <w:r>
+              <w:rPr>
+                <w:rStyle w:val="VerbatimChar"/>
+              </w:rPr>
+              <w:t xml:space="preserve">pulp-platform/axi</w:t>
+            </w:r>
+          </w:p>
+        </w:tc>
+        <w:tc>
+          <w:tcPr/>
+          <w:p>
+            <w:pPr>
+              <w:pStyle w:val="Compact"/>
+              <w:jc w:val="left"/>
+            </w:pPr>
+            <w:r>
+              <w:rPr>
+                <w:rStyle w:val="VerbatimChar"/>
+              </w:rPr>
+              <w:t xml:space="preserve">axi/typedef.svh</w:t>
+            </w:r>
+          </w:p>
+        </w:tc>
+        <w:tc>
+          <w:tcPr/>
+          <w:p>
+            <w:pPr>
+              <w:pStyle w:val="Compact"/>
+              <w:jc w:val="left"/>
+            </w:pPr>
+            <w:r>
+              <w:rPr>
+                <w:rStyle w:val="VerbatimChar"/>
+              </w:rPr>
+              <w:t xml:space="preserve">70b8e54f</w:t>
+            </w:r>
+            <w:r>
+              <w:t xml:space="preserve">, vendored</w:t>
+            </w:r>
+          </w:p>
+        </w:tc>
+        <w:tc>
+          <w:tcPr/>
+          <w:p>
+            <w:pPr>
+              <w:pStyle w:val="Compact"/>
+              <w:jc w:val="left"/>
+            </w:pPr>
+            <w:r>
+              <w:t xml:space="preserve">SHL-0.51</w:t>
+            </w:r>
+          </w:p>
+        </w:tc>
+      </w:tr>
+      <w:tr>
+        <w:tc>
+          <w:tcPr/>
+          <w:p>
+            <w:pPr>
+              <w:pStyle w:val="Compact"/>
+              <w:jc w:val="left"/>
+            </w:pPr>
+            <w:r>
+              <w:rPr>
+                <w:rStyle w:val="VerbatimChar"/>
+              </w:rPr>
+              <w:t xml:space="preserve">pulp-platform/apb</w:t>
+            </w:r>
+          </w:p>
+        </w:tc>
+        <w:tc>
+          <w:tcPr/>
+          <w:p>
+            <w:pPr>
+              <w:pStyle w:val="Compact"/>
+              <w:jc w:val="left"/>
+            </w:pPr>
+            <w:r>
+              <w:rPr>
+                <w:rStyle w:val="VerbatimChar"/>
+              </w:rPr>
+              <w:t xml:space="preserve">apb/typedef.svh</w:t>
+            </w:r>
+          </w:p>
+        </w:tc>
+        <w:tc>
+          <w:tcPr/>
+          <w:p>
+            <w:pPr>
+              <w:pStyle w:val="Compact"/>
+              <w:jc w:val="left"/>
+            </w:pPr>
+            <w:r>
+              <w:rPr>
+                <w:rStyle w:val="VerbatimChar"/>
+              </w:rPr>
+              <w:t xml:space="preserve">6ae8bf8d</w:t>
+            </w:r>
+            <w:r>
+              <w:t xml:space="preserve">, as iDMA pins</w:t>
+            </w:r>
+          </w:p>
+        </w:tc>
+        <w:tc>
+          <w:tcPr/>
+          <w:p>
+            <w:pPr>
+              <w:pStyle w:val="Compact"/>
+              <w:jc w:val="left"/>
+            </w:pPr>
+            <w:r>
+              <w:t xml:space="preserve">SHL-0.51</w:t>
+            </w:r>
+          </w:p>
+        </w:tc>
+      </w:tr>
     </w:tbl>
     <w:p>
       <w:pPr>
@@ -8029,6 +8412,61 @@
       </w:pPr>
       <w:r>
         <w:t xml:space="preserve">Generate the files of 7.6 and commit them with the commands.</w:t>
+      </w:r>
+    </w:p>
+    <w:p>
+      <w:pPr>
+        <w:pStyle w:val="Compact"/>
+        <w:numPr>
+          <w:ilvl w:val="0"/>
+          <w:numId w:val="1009"/>
+        </w:numPr>
+        <w:jc w:val="left"/>
+      </w:pPr>
+      <w:r>
+        <w:t xml:space="preserve">Add the</w:t>
+      </w:r>
+      <w:r>
+        <w:t xml:space="preserve"> </w:t>
+      </w:r>
+      <w:r>
+        <w:rPr>
+          <w:rStyle w:val="VerbatimChar"/>
+        </w:rPr>
+        <w:t xml:space="preserve">cc_*</w:t>
+      </w:r>
+      <w:r>
+        <w:t xml:space="preserve"> </w:t>
+      </w:r>
+      <w:r>
+        <w:t xml:space="preserve">modules of section 4 to the</w:t>
+      </w:r>
+      <w:r>
+        <w:t xml:space="preserve"> </w:t>
+      </w:r>
+      <w:r>
+        <w:rPr>
+          <w:rStyle w:val="VerbatimChar"/>
+        </w:rPr>
+        <w:t xml:space="preserve">common_cells</w:t>
+      </w:r>
+      <w:r>
+        <w:t xml:space="preserve"> </w:t>
+      </w:r>
+      <w:r>
+        <w:t xml:space="preserve">copy, and vendor</w:t>
+      </w:r>
+      <w:r>
+        <w:t xml:space="preserve"> </w:t>
+      </w:r>
+      <w:r>
+        <w:rPr>
+          <w:rStyle w:val="VerbatimChar"/>
+        </w:rPr>
+        <w:t xml:space="preserve">apb</w:t>
+      </w:r>
+      <w:r>
+        <w:t xml:space="preserve">.</w:t>
       </w:r>
     </w:p>
     <w:p>
@@ -9216,7 +9654,7 @@
       <w:rPr>
         <w:szCs w:val="26"/>
       </w:rPr>
-      <w:t>V3.0</w:t>
+      <w:t>V3.1</w:t>
     </w:r>
     <w:r>
       <w:rPr>

</xml_diff>

<commit_message>
docs(dma): v3.3, the mentor's approval of the ip and its interface
No change in behaviour. The mentor approved upstream iDMA and its
interface (APB4 on APB_M13, AXI4 on AXI_S2) on 2026-10-05; new features
are a separate discussion. Section 4 drops cc_stream_fork and
cc_stream_join: the list, with the generated files of 7.6, elaborates the
four modules of section 3 with Verilator and needs neither. Appendix B
records why a FIFO register needs a 2D job (simulated).
</commit_message>
<xml_diff>
--- a/doc/specs/docx/QNSC_DMA_MAS.docx
+++ b/doc/specs/docx/QNSC_DMA_MAS.docx
@@ -15,7 +15,7 @@
         <w:pStyle w:val="Subtitle"/>
       </w:pPr>
       <w:r>
-        <w:t xml:space="preserve">MICRO-ARCHITECTURE SPECIFICATION – V3.2</w:t>
+        <w:t xml:space="preserve">MICRO-ARCHITECTURE SPECIFICATION – V3.3</w:t>
       </w:r>
     </w:p>
     <w:p>
@@ -780,6 +780,113 @@
           </w:p>
         </w:tc>
       </w:tr>
+      <w:tr>
+        <w:tc>
+          <w:tcPr/>
+          <w:p>
+            <w:pPr>
+              <w:pStyle w:val="Compact"/>
+              <w:jc w:val="left"/>
+            </w:pPr>
+            <w:r>
+              <w:t xml:space="preserve">V3.3</w:t>
+            </w:r>
+          </w:p>
+        </w:tc>
+        <w:tc>
+          <w:tcPr/>
+          <w:p>
+            <w:pPr>
+              <w:pStyle w:val="Compact"/>
+              <w:jc w:val="left"/>
+            </w:pPr>
+            <w:r>
+              <w:t xml:space="preserve">2026-10-05</w:t>
+            </w:r>
+          </w:p>
+        </w:tc>
+        <w:tc>
+          <w:tcPr/>
+          <w:p>
+            <w:pPr>
+              <w:pStyle w:val="Compact"/>
+              <w:jc w:val="left"/>
+            </w:pPr>
+            <w:r>
+              <w:t xml:space="preserve">Nghia VT (lead)</w:t>
+            </w:r>
+          </w:p>
+        </w:tc>
+        <w:tc>
+          <w:tcPr/>
+          <w:p>
+            <w:pPr>
+              <w:pStyle w:val="Compact"/>
+              <w:jc w:val="left"/>
+            </w:pPr>
+            <w:r>
+              <w:t xml:space="preserve">Quan (mentor)</w:t>
+            </w:r>
+          </w:p>
+        </w:tc>
+        <w:tc>
+          <w:tcPr/>
+          <w:p>
+            <w:pPr>
+              <w:pStyle w:val="Compact"/>
+              <w:jc w:val="left"/>
+            </w:pPr>
+            <w:r>
+              <w:t xml:space="preserve">The mentor approved the IP and its interface (Appendix B). Section 4:</w:t>
+            </w:r>
+            <w:r>
+              <w:t xml:space="preserve"> </w:t>
+            </w:r>
+            <w:r>
+              <w:rPr>
+                <w:rStyle w:val="VerbatimChar"/>
+              </w:rPr>
+              <w:t xml:space="preserve">cc_stream_fork</w:t>
+            </w:r>
+            <w:r>
+              <w:t xml:space="preserve"> </w:t>
+            </w:r>
+            <w:r>
+              <w:t xml:space="preserve">and</w:t>
+            </w:r>
+            <w:r>
+              <w:t xml:space="preserve"> </w:t>
+            </w:r>
+            <w:r>
+              <w:rPr>
+                <w:rStyle w:val="VerbatimChar"/>
+              </w:rPr>
+              <w:t xml:space="preserve">cc_stream_join</w:t>
+            </w:r>
+            <w:r>
+              <w:t xml:space="preserve"> </w:t>
+            </w:r>
+            <w:r>
+              <w:t xml:space="preserve">removed, the list checked by elaborating the four modules of 3 with Verilator;</w:t>
+            </w:r>
+            <w:r>
+              <w:t xml:space="preserve"> </w:t>
+            </w:r>
+            <w:r>
+              <w:rPr>
+                <w:rStyle w:val="VerbatimChar"/>
+              </w:rPr>
+              <w:t xml:space="preserve">DMA_003</w:t>
+            </w:r>
+            <w:r>
+              <w:t xml:space="preserve"> </w:t>
+            </w:r>
+            <w:r>
+              <w:t xml:space="preserve">checked in simulation. No change in behaviour</w:t>
+            </w:r>
+          </w:p>
+        </w:tc>
+      </w:tr>
     </w:tbl>
     <w:bookmarkEnd w:id="26"/>
     <w:bookmarkStart w:id="27" w:name="overview"/>
@@ -2168,30 +2275,6 @@
               <w:t xml:space="preserve">cc_popcount</w:t>
             </w:r>
             <w:r>
-              <w:t xml:space="preserve">,</w:t>
-            </w:r>
-            <w:r>
-              <w:t xml:space="preserve"> </w:t>
-            </w:r>
-            <w:r>
-              <w:rPr>
-                <w:rStyle w:val="VerbatimChar"/>
-              </w:rPr>
-              <w:t xml:space="preserve">cc_stream_fork</w:t>
-            </w:r>
-            <w:r>
-              <w:t xml:space="preserve">,</w:t>
-            </w:r>
-            <w:r>
-              <w:t xml:space="preserve"> </w:t>
-            </w:r>
-            <w:r>
-              <w:rPr>
-                <w:rStyle w:val="VerbatimChar"/>
-              </w:rPr>
-              <w:t xml:space="preserve">cc_stream_join</w:t>
-            </w:r>
-            <w:r>
               <w:t xml:space="preserve">;</w:t>
             </w:r>
             <w:r>
@@ -2420,7 +2503,19 @@
         <w:pStyle w:val="BodyText"/>
       </w:pPr>
       <w:r>
-        <w:t xml:space="preserve">The filelist is checked by</w:t>
+        <w:t xml:space="preserve">These files, with the generated files of 7.6, elaborate the four modules of 3 in the configuration of 5 with no module missing (Verilator 5.052,</w:t>
+      </w:r>
+      <w:r>
+        <w:t xml:space="preserve"> </w:t>
+      </w:r>
+      <w:r>
+        <w:rPr>
+          <w:rStyle w:val="VerbatimChar"/>
+        </w:rPr>
+        <w:t xml:space="preserve">--lint-only</w:t>
+      </w:r>
+      <w:r>
+        <w:t xml:space="preserve">, 2026-10-05).</w:t>
       </w:r>
       <w:r>
         <w:t xml:space="preserve"> </w:t>
@@ -2450,7 +2545,7 @@
         <w:t xml:space="preserve"> </w:t>
       </w:r>
       <w:r>
-        <w:t xml:space="preserve">once the wrapper exists: a module a tool reports missing is added, and nothing else.</w:t>
+        <w:t xml:space="preserve">check it again once the wrapper exists: a module a tool reports missing is added, and nothing else.</w:t>
       </w:r>
       <w:r>
         <w:t xml:space="preserve"> </w:t>
@@ -12046,6 +12141,220 @@
             </w:pPr>
             <w:r>
               <w:t xml:space="preserve">Not in V3.x: it adds a register to the wrapper</w:t>
+            </w:r>
+          </w:p>
+        </w:tc>
+      </w:tr>
+      <w:tr>
+        <w:tc>
+          <w:tcPr/>
+          <w:p>
+            <w:pPr>
+              <w:pStyle w:val="Compact"/>
+              <w:jc w:val="left"/>
+            </w:pPr>
+            <w:r>
+              <w:t xml:space="preserve">IP evaluation: interface, and is it usable in QSOC?</w:t>
+            </w:r>
+          </w:p>
+        </w:tc>
+        <w:tc>
+          <w:tcPr/>
+          <w:p>
+            <w:pPr>
+              <w:pStyle w:val="Compact"/>
+              <w:jc w:val="left"/>
+            </w:pPr>
+            <w:r>
+              <w:t xml:space="preserve">Quan (mentor), 2026-10-05</w:t>
+            </w:r>
+          </w:p>
+        </w:tc>
+        <w:tc>
+          <w:tcPr/>
+          <w:p>
+            <w:pPr>
+              <w:pStyle w:val="Compact"/>
+              <w:jc w:val="left"/>
+            </w:pPr>
+            <w:r>
+              <w:t xml:space="preserve">Approved: frontend APB4 slave on</w:t>
+            </w:r>
+            <w:r>
+              <w:t xml:space="preserve"> </w:t>
+            </w:r>
+            <w:r>
+              <w:rPr>
+                <w:rStyle w:val="VerbatimChar"/>
+              </w:rPr>
+              <w:t xml:space="preserve">P_BUS</w:t>
+            </w:r>
+            <w:r>
+              <w:t xml:space="preserve"> </w:t>
+            </w:r>
+            <w:r>
+              <w:rPr>
+                <w:rStyle w:val="VerbatimChar"/>
+              </w:rPr>
+              <w:t xml:space="preserve">APB_M13</w:t>
+            </w:r>
+            <w:r>
+              <w:t xml:space="preserve">, backend AXI4 master on</w:t>
+            </w:r>
+            <w:r>
+              <w:t xml:space="preserve"> </w:t>
+            </w:r>
+            <w:r>
+              <w:rPr>
+                <w:rStyle w:val="VerbatimChar"/>
+              </w:rPr>
+              <w:t xml:space="preserve">S_BUS</w:t>
+            </w:r>
+            <w:r>
+              <w:t xml:space="preserve"> </w:t>
+            </w:r>
+            <w:r>
+              <w:rPr>
+                <w:rStyle w:val="VerbatimChar"/>
+              </w:rPr>
+              <w:t xml:space="preserve">AXI_S2</w:t>
+            </w:r>
+            <w:r>
+              <w:t xml:space="preserve">, both generated from upstream templates (5, 7.6). New features (interrupt flags, hardware request) are a separate discussion</w:t>
+            </w:r>
+          </w:p>
+        </w:tc>
+      </w:tr>
+      <w:tr>
+        <w:tc>
+          <w:tcPr/>
+          <w:p>
+            <w:pPr>
+              <w:pStyle w:val="Compact"/>
+              <w:jc w:val="left"/>
+            </w:pPr>
+            <w:r>
+              <w:t xml:space="preserve">Can a 1D job fill a FIFO register?</w:t>
+            </w:r>
+          </w:p>
+        </w:tc>
+        <w:tc>
+          <w:tcPr/>
+          <w:p>
+            <w:pPr>
+              <w:pStyle w:val="Compact"/>
+              <w:jc w:val="left"/>
+            </w:pPr>
+            <w:r>
+              <w:t xml:space="preserve">lead, simulation</w:t>
+            </w:r>
+          </w:p>
+        </w:tc>
+        <w:tc>
+          <w:tcPr/>
+          <w:p>
+            <w:pPr>
+              <w:pStyle w:val="Compact"/>
+              <w:jc w:val="left"/>
+            </w:pPr>
+            <w:r>
+              <w:t xml:space="preserve">No: the frontend drives</w:t>
+            </w:r>
+            <w:r>
+              <w:t xml:space="preserve"> </w:t>
+            </w:r>
+            <w:r>
+              <w:rPr>
+                <w:rStyle w:val="VerbatimChar"/>
+              </w:rPr>
+              <w:t xml:space="preserve">INCR</w:t>
+            </w:r>
+            <w:r>
+              <w:t xml:space="preserve">, and on a 32-bit bus five bytes become one 4-byte beat to</w:t>
+            </w:r>
+            <w:r>
+              <w:t xml:space="preserve"> </w:t>
+            </w:r>
+            <w:r>
+              <w:rPr>
+                <w:rStyle w:val="VerbatimChar"/>
+              </w:rPr>
+              <w:t xml:space="preserve">THR</w:t>
+            </w:r>
+            <w:r>
+              <w:t xml:space="preserve"> </w:t>
+            </w:r>
+            <w:r>
+              <w:t xml:space="preserve">and one to</w:t>
+            </w:r>
+            <w:r>
+              <w:t xml:space="preserve"> </w:t>
+            </w:r>
+            <w:r>
+              <w:rPr>
+                <w:rStyle w:val="VerbatimChar"/>
+              </w:rPr>
+              <w:t xml:space="preserve">IER</w:t>
+            </w:r>
+            <w:r>
+              <w:t xml:space="preserve">. A 2D job with</w:t>
+            </w:r>
+            <w:r>
+              <w:t xml:space="preserve"> </w:t>
+            </w:r>
+            <w:r>
+              <w:rPr>
+                <w:rStyle w:val="VerbatimChar"/>
+              </w:rPr>
+              <w:t xml:space="preserve">LENGTH</w:t>
+            </w:r>
+            <w:r>
+              <w:t xml:space="preserve"> </w:t>
+            </w:r>
+            <w:r>
+              <w:t xml:space="preserve">= 1 and</w:t>
+            </w:r>
+            <w:r>
+              <w:t xml:space="preserve"> </w:t>
+            </w:r>
+            <w:r>
+              <w:rPr>
+                <w:rStyle w:val="VerbatimChar"/>
+              </w:rPr>
+              <w:t xml:space="preserve">DST_STRIDE</w:t>
+            </w:r>
+            <w:r>
+              <w:t xml:space="preserve"> </w:t>
+            </w:r>
+            <w:r>
+              <w:t xml:space="preserve">= 0 writes</w:t>
+            </w:r>
+            <w:r>
+              <w:t xml:space="preserve"> </w:t>
+            </w:r>
+            <w:r>
+              <w:rPr>
+                <w:rStyle w:val="VerbatimChar"/>
+              </w:rPr>
+              <w:t xml:space="preserve">THR</w:t>
+            </w:r>
+            <w:r>
+              <w:t xml:space="preserve"> </w:t>
+            </w:r>
+            <w:r>
+              <w:t xml:space="preserve">five times with one byte lane each (7.3,</w:t>
+            </w:r>
+            <w:r>
+              <w:t xml:space="preserve"> </w:t>
+            </w:r>
+            <w:r>
+              <w:rPr>
+                <w:rStyle w:val="VerbatimChar"/>
+              </w:rPr>
+              <w:t xml:space="preserve">DMA_003</w:t>
+            </w:r>
+            <w:r>
+              <w:t xml:space="preserve">)</w:t>
             </w:r>
           </w:p>
         </w:tc>
@@ -12290,7 +12599,7 @@
       <w:rPr>
         <w:szCs w:val="26"/>
       </w:rPr>
-      <w:t>V3.2</w:t>
+      <w:t>V3.3</w:t>
     </w:r>
     <w:r>
       <w:rPr>

</xml_diff>

<commit_message>
docs(dma): v3.3, the mentor's approval of the ip and its interface (#64)
No change in behaviour. The mentor approved upstream iDMA and its
interface (APB4 on APB_M13, AXI4 on AXI_S2) on 2026-10-05; new features
are a separate discussion. Section 4 drops cc_stream_fork and
cc_stream_join: the list, with the generated files of 7.6, elaborates the
four modules of section 3 with Verilator and needs neither. Appendix B
records why a FIFO register needs a 2D job (simulated).
</commit_message>
<xml_diff>
--- a/doc/specs/docx/QNSC_DMA_MAS.docx
+++ b/doc/specs/docx/QNSC_DMA_MAS.docx
@@ -15,7 +15,7 @@
         <w:pStyle w:val="Subtitle"/>
       </w:pPr>
       <w:r>
-        <w:t xml:space="preserve">MICRO-ARCHITECTURE SPECIFICATION – V3.2</w:t>
+        <w:t xml:space="preserve">MICRO-ARCHITECTURE SPECIFICATION – V3.3</w:t>
       </w:r>
     </w:p>
     <w:p>
@@ -780,6 +780,113 @@
           </w:p>
         </w:tc>
       </w:tr>
+      <w:tr>
+        <w:tc>
+          <w:tcPr/>
+          <w:p>
+            <w:pPr>
+              <w:pStyle w:val="Compact"/>
+              <w:jc w:val="left"/>
+            </w:pPr>
+            <w:r>
+              <w:t xml:space="preserve">V3.3</w:t>
+            </w:r>
+          </w:p>
+        </w:tc>
+        <w:tc>
+          <w:tcPr/>
+          <w:p>
+            <w:pPr>
+              <w:pStyle w:val="Compact"/>
+              <w:jc w:val="left"/>
+            </w:pPr>
+            <w:r>
+              <w:t xml:space="preserve">2026-10-05</w:t>
+            </w:r>
+          </w:p>
+        </w:tc>
+        <w:tc>
+          <w:tcPr/>
+          <w:p>
+            <w:pPr>
+              <w:pStyle w:val="Compact"/>
+              <w:jc w:val="left"/>
+            </w:pPr>
+            <w:r>
+              <w:t xml:space="preserve">Nghia VT (lead)</w:t>
+            </w:r>
+          </w:p>
+        </w:tc>
+        <w:tc>
+          <w:tcPr/>
+          <w:p>
+            <w:pPr>
+              <w:pStyle w:val="Compact"/>
+              <w:jc w:val="left"/>
+            </w:pPr>
+            <w:r>
+              <w:t xml:space="preserve">Quan (mentor)</w:t>
+            </w:r>
+          </w:p>
+        </w:tc>
+        <w:tc>
+          <w:tcPr/>
+          <w:p>
+            <w:pPr>
+              <w:pStyle w:val="Compact"/>
+              <w:jc w:val="left"/>
+            </w:pPr>
+            <w:r>
+              <w:t xml:space="preserve">The mentor approved the IP and its interface (Appendix B). Section 4:</w:t>
+            </w:r>
+            <w:r>
+              <w:t xml:space="preserve"> </w:t>
+            </w:r>
+            <w:r>
+              <w:rPr>
+                <w:rStyle w:val="VerbatimChar"/>
+              </w:rPr>
+              <w:t xml:space="preserve">cc_stream_fork</w:t>
+            </w:r>
+            <w:r>
+              <w:t xml:space="preserve"> </w:t>
+            </w:r>
+            <w:r>
+              <w:t xml:space="preserve">and</w:t>
+            </w:r>
+            <w:r>
+              <w:t xml:space="preserve"> </w:t>
+            </w:r>
+            <w:r>
+              <w:rPr>
+                <w:rStyle w:val="VerbatimChar"/>
+              </w:rPr>
+              <w:t xml:space="preserve">cc_stream_join</w:t>
+            </w:r>
+            <w:r>
+              <w:t xml:space="preserve"> </w:t>
+            </w:r>
+            <w:r>
+              <w:t xml:space="preserve">removed, the list checked by elaborating the four modules of 3 with Verilator;</w:t>
+            </w:r>
+            <w:r>
+              <w:t xml:space="preserve"> </w:t>
+            </w:r>
+            <w:r>
+              <w:rPr>
+                <w:rStyle w:val="VerbatimChar"/>
+              </w:rPr>
+              <w:t xml:space="preserve">DMA_003</w:t>
+            </w:r>
+            <w:r>
+              <w:t xml:space="preserve"> </w:t>
+            </w:r>
+            <w:r>
+              <w:t xml:space="preserve">checked in simulation. No change in behaviour</w:t>
+            </w:r>
+          </w:p>
+        </w:tc>
+      </w:tr>
     </w:tbl>
     <w:bookmarkEnd w:id="26"/>
     <w:bookmarkStart w:id="27" w:name="overview"/>
@@ -2168,30 +2275,6 @@
               <w:t xml:space="preserve">cc_popcount</w:t>
             </w:r>
             <w:r>
-              <w:t xml:space="preserve">,</w:t>
-            </w:r>
-            <w:r>
-              <w:t xml:space="preserve"> </w:t>
-            </w:r>
-            <w:r>
-              <w:rPr>
-                <w:rStyle w:val="VerbatimChar"/>
-              </w:rPr>
-              <w:t xml:space="preserve">cc_stream_fork</w:t>
-            </w:r>
-            <w:r>
-              <w:t xml:space="preserve">,</w:t>
-            </w:r>
-            <w:r>
-              <w:t xml:space="preserve"> </w:t>
-            </w:r>
-            <w:r>
-              <w:rPr>
-                <w:rStyle w:val="VerbatimChar"/>
-              </w:rPr>
-              <w:t xml:space="preserve">cc_stream_join</w:t>
-            </w:r>
-            <w:r>
               <w:t xml:space="preserve">;</w:t>
             </w:r>
             <w:r>
@@ -2420,7 +2503,19 @@
         <w:pStyle w:val="BodyText"/>
       </w:pPr>
       <w:r>
-        <w:t xml:space="preserve">The filelist is checked by</w:t>
+        <w:t xml:space="preserve">These files, with the generated files of 7.6, elaborate the four modules of 3 in the configuration of 5 with no module missing (Verilator 5.052,</w:t>
+      </w:r>
+      <w:r>
+        <w:t xml:space="preserve"> </w:t>
+      </w:r>
+      <w:r>
+        <w:rPr>
+          <w:rStyle w:val="VerbatimChar"/>
+        </w:rPr>
+        <w:t xml:space="preserve">--lint-only</w:t>
+      </w:r>
+      <w:r>
+        <w:t xml:space="preserve">, 2026-10-05).</w:t>
       </w:r>
       <w:r>
         <w:t xml:space="preserve"> </w:t>
@@ -2450,7 +2545,7 @@
         <w:t xml:space="preserve"> </w:t>
       </w:r>
       <w:r>
-        <w:t xml:space="preserve">once the wrapper exists: a module a tool reports missing is added, and nothing else.</w:t>
+        <w:t xml:space="preserve">check it again once the wrapper exists: a module a tool reports missing is added, and nothing else.</w:t>
       </w:r>
       <w:r>
         <w:t xml:space="preserve"> </w:t>
@@ -12046,6 +12141,220 @@
             </w:pPr>
             <w:r>
               <w:t xml:space="preserve">Not in V3.x: it adds a register to the wrapper</w:t>
+            </w:r>
+          </w:p>
+        </w:tc>
+      </w:tr>
+      <w:tr>
+        <w:tc>
+          <w:tcPr/>
+          <w:p>
+            <w:pPr>
+              <w:pStyle w:val="Compact"/>
+              <w:jc w:val="left"/>
+            </w:pPr>
+            <w:r>
+              <w:t xml:space="preserve">IP evaluation: interface, and is it usable in QSOC?</w:t>
+            </w:r>
+          </w:p>
+        </w:tc>
+        <w:tc>
+          <w:tcPr/>
+          <w:p>
+            <w:pPr>
+              <w:pStyle w:val="Compact"/>
+              <w:jc w:val="left"/>
+            </w:pPr>
+            <w:r>
+              <w:t xml:space="preserve">Quan (mentor), 2026-10-05</w:t>
+            </w:r>
+          </w:p>
+        </w:tc>
+        <w:tc>
+          <w:tcPr/>
+          <w:p>
+            <w:pPr>
+              <w:pStyle w:val="Compact"/>
+              <w:jc w:val="left"/>
+            </w:pPr>
+            <w:r>
+              <w:t xml:space="preserve">Approved: frontend APB4 slave on</w:t>
+            </w:r>
+            <w:r>
+              <w:t xml:space="preserve"> </w:t>
+            </w:r>
+            <w:r>
+              <w:rPr>
+                <w:rStyle w:val="VerbatimChar"/>
+              </w:rPr>
+              <w:t xml:space="preserve">P_BUS</w:t>
+            </w:r>
+            <w:r>
+              <w:t xml:space="preserve"> </w:t>
+            </w:r>
+            <w:r>
+              <w:rPr>
+                <w:rStyle w:val="VerbatimChar"/>
+              </w:rPr>
+              <w:t xml:space="preserve">APB_M13</w:t>
+            </w:r>
+            <w:r>
+              <w:t xml:space="preserve">, backend AXI4 master on</w:t>
+            </w:r>
+            <w:r>
+              <w:t xml:space="preserve"> </w:t>
+            </w:r>
+            <w:r>
+              <w:rPr>
+                <w:rStyle w:val="VerbatimChar"/>
+              </w:rPr>
+              <w:t xml:space="preserve">S_BUS</w:t>
+            </w:r>
+            <w:r>
+              <w:t xml:space="preserve"> </w:t>
+            </w:r>
+            <w:r>
+              <w:rPr>
+                <w:rStyle w:val="VerbatimChar"/>
+              </w:rPr>
+              <w:t xml:space="preserve">AXI_S2</w:t>
+            </w:r>
+            <w:r>
+              <w:t xml:space="preserve">, both generated from upstream templates (5, 7.6). New features (interrupt flags, hardware request) are a separate discussion</w:t>
+            </w:r>
+          </w:p>
+        </w:tc>
+      </w:tr>
+      <w:tr>
+        <w:tc>
+          <w:tcPr/>
+          <w:p>
+            <w:pPr>
+              <w:pStyle w:val="Compact"/>
+              <w:jc w:val="left"/>
+            </w:pPr>
+            <w:r>
+              <w:t xml:space="preserve">Can a 1D job fill a FIFO register?</w:t>
+            </w:r>
+          </w:p>
+        </w:tc>
+        <w:tc>
+          <w:tcPr/>
+          <w:p>
+            <w:pPr>
+              <w:pStyle w:val="Compact"/>
+              <w:jc w:val="left"/>
+            </w:pPr>
+            <w:r>
+              <w:t xml:space="preserve">lead, simulation</w:t>
+            </w:r>
+          </w:p>
+        </w:tc>
+        <w:tc>
+          <w:tcPr/>
+          <w:p>
+            <w:pPr>
+              <w:pStyle w:val="Compact"/>
+              <w:jc w:val="left"/>
+            </w:pPr>
+            <w:r>
+              <w:t xml:space="preserve">No: the frontend drives</w:t>
+            </w:r>
+            <w:r>
+              <w:t xml:space="preserve"> </w:t>
+            </w:r>
+            <w:r>
+              <w:rPr>
+                <w:rStyle w:val="VerbatimChar"/>
+              </w:rPr>
+              <w:t xml:space="preserve">INCR</w:t>
+            </w:r>
+            <w:r>
+              <w:t xml:space="preserve">, and on a 32-bit bus five bytes become one 4-byte beat to</w:t>
+            </w:r>
+            <w:r>
+              <w:t xml:space="preserve"> </w:t>
+            </w:r>
+            <w:r>
+              <w:rPr>
+                <w:rStyle w:val="VerbatimChar"/>
+              </w:rPr>
+              <w:t xml:space="preserve">THR</w:t>
+            </w:r>
+            <w:r>
+              <w:t xml:space="preserve"> </w:t>
+            </w:r>
+            <w:r>
+              <w:t xml:space="preserve">and one to</w:t>
+            </w:r>
+            <w:r>
+              <w:t xml:space="preserve"> </w:t>
+            </w:r>
+            <w:r>
+              <w:rPr>
+                <w:rStyle w:val="VerbatimChar"/>
+              </w:rPr>
+              <w:t xml:space="preserve">IER</w:t>
+            </w:r>
+            <w:r>
+              <w:t xml:space="preserve">. A 2D job with</w:t>
+            </w:r>
+            <w:r>
+              <w:t xml:space="preserve"> </w:t>
+            </w:r>
+            <w:r>
+              <w:rPr>
+                <w:rStyle w:val="VerbatimChar"/>
+              </w:rPr>
+              <w:t xml:space="preserve">LENGTH</w:t>
+            </w:r>
+            <w:r>
+              <w:t xml:space="preserve"> </w:t>
+            </w:r>
+            <w:r>
+              <w:t xml:space="preserve">= 1 and</w:t>
+            </w:r>
+            <w:r>
+              <w:t xml:space="preserve"> </w:t>
+            </w:r>
+            <w:r>
+              <w:rPr>
+                <w:rStyle w:val="VerbatimChar"/>
+              </w:rPr>
+              <w:t xml:space="preserve">DST_STRIDE</w:t>
+            </w:r>
+            <w:r>
+              <w:t xml:space="preserve"> </w:t>
+            </w:r>
+            <w:r>
+              <w:t xml:space="preserve">= 0 writes</w:t>
+            </w:r>
+            <w:r>
+              <w:t xml:space="preserve"> </w:t>
+            </w:r>
+            <w:r>
+              <w:rPr>
+                <w:rStyle w:val="VerbatimChar"/>
+              </w:rPr>
+              <w:t xml:space="preserve">THR</w:t>
+            </w:r>
+            <w:r>
+              <w:t xml:space="preserve"> </w:t>
+            </w:r>
+            <w:r>
+              <w:t xml:space="preserve">five times with one byte lane each (7.3,</w:t>
+            </w:r>
+            <w:r>
+              <w:t xml:space="preserve"> </w:t>
+            </w:r>
+            <w:r>
+              <w:rPr>
+                <w:rStyle w:val="VerbatimChar"/>
+              </w:rPr>
+              <w:t xml:space="preserve">DMA_003</w:t>
+            </w:r>
+            <w:r>
+              <w:t xml:space="preserve">)</w:t>
             </w:r>
           </w:p>
         </w:tc>
@@ -12290,7 +12599,7 @@
       <w:rPr>
         <w:szCs w:val="26"/>
       </w:rPr>
-      <w:t>V3.2</w:t>
+      <w:t>V3.3</w:t>
     </w:r>
     <w:r>
       <w:rPr>

</xml_diff>